<commit_message>
docs: 261030 — todos os integrantes colaboraram
Co-Authored-By: Claude Sonnet 5.5 <noreply@anthropic.com>
Claude-Session: https://claude.ai/code/session_018iRo33mDVm62kCLbABPyms
</commit_message>
<xml_diff>
--- a/docs/entrega/ProjetoG2_261030.docx
+++ b/docs/entrega/ProjetoG2_261030.docx
@@ -164,7 +164,7 @@
               <w:rPr>
                 <w:sz w:val="19"/>
               </w:rPr>
-              <w:t>[ ] sim   [ ] não   ← preencher</w:t>
+              <w:t>Sim</w:t>
             </w:r>
           </w:p>
         </w:tc>
@@ -205,7 +205,7 @@
               <w:rPr>
                 <w:sz w:val="19"/>
               </w:rPr>
-              <w:t>[ ] sim   [ ] não   ← preencher</w:t>
+              <w:t>Sim</w:t>
             </w:r>
           </w:p>
         </w:tc>
@@ -246,7 +246,7 @@
               <w:rPr>
                 <w:sz w:val="19"/>
               </w:rPr>
-              <w:t>[ ] sim   [ ] não   ← preencher</w:t>
+              <w:t>Sim</w:t>
             </w:r>
           </w:p>
         </w:tc>
@@ -287,7 +287,7 @@
               <w:rPr>
                 <w:sz w:val="19"/>
               </w:rPr>
-              <w:t>[ ] sim   [ ] não   ← preencher</w:t>
+              <w:t>Sim</w:t>
             </w:r>
           </w:p>
         </w:tc>
@@ -299,12 +299,15 @@
       </w:pPr>
     </w:p>
     <w:p>
+      <w:pPr>
+        <w:spacing w:after="120"/>
+      </w:pPr>
       <w:r>
         <w:rPr>
-          <w:b/>
-          <w:highlight w:val="yellow"/>
+          <w:b w:val="0"/>
+          <w:i w:val="0"/>
         </w:rPr>
-        <w:t>ATENÇÃO (apagar após preencher): o código não registra quem participou da aula de 30/10. Marque acima quem colaborou hoje.</w:t>
+        <w:t>Todos os integrantes colaboraram na aula de 30/10.</w:t>
       </w:r>
     </w:p>
     <w:p>

</xml_diff>

<commit_message>
docs: 261030 — remove seção 6
Co-Authored-By: Claude Sonnet 5.5 <noreply@anthropic.com>
Claude-Session: https://claude.ai/code/session_018iRo33mDVm62kCLbABPyms
</commit_message>
<xml_diff>
--- a/docs/entrega/ProjetoG2_261030.docx
+++ b/docs/entrega/ProjetoG2_261030.docx
@@ -11643,26 +11643,6 @@
       <w:pPr>
         <w:spacing w:after="40"/>
       </w:pPr>
-    </w:p>
-    <w:p>
-      <w:pPr>
-        <w:pStyle w:val="Heading1"/>
-      </w:pPr>
-      <w:r>
-        <w:t>6. Observação</w:t>
-      </w:r>
-    </w:p>
-    <w:p>
-      <w:pPr>
-        <w:spacing w:after="120"/>
-      </w:pPr>
-      <w:r>
-        <w:rPr>
-          <w:b w:val="0"/>
-          <w:i w:val="0"/>
-        </w:rPr>
-        <w:t>As telas e os trechos refletem o estado do projeto em 30/10/2026. O model continua sendo desenvolvido; os trechos de código deste documento são gerados a partir dos arquivos da API a cada execução do script de build.</w:t>
-      </w:r>
     </w:p>
     <w:sectPr>
       <w:pgSz w:w="11906" w:h="16838"/>

</xml_diff>